<commit_message>
Implémente le socle intégré du MVP liquide
</commit_message>
<xml_diff>
--- a/docs/specifications/source/00_Index_du_dossier_documentaire.docx
+++ b/docs/specifications/source/00_Index_du_dossier_documentaire.docx
@@ -305,7 +305,7 @@
                 <w:color w:val="243447"/>
                 <w:sz w:val="18"/>
               </w:rPr>
-              <w:t>2 développeurs, avec assistants IA</w:t>
+              <w:t>2 développeurs, avec validation métier et scientifique</w:t>
             </w:r>
           </w:p>
         </w:tc>
@@ -692,7 +692,7 @@
                 <w:color w:val="243447"/>
                 <w:sz w:val="18"/>
               </w:rPr>
-              <w:t>Équipe projet - 2 développeurs assistés par IA</w:t>
+              <w:t>Équipe projet - 2 développeurs</w:t>
             </w:r>
           </w:p>
         </w:tc>
@@ -3414,7 +3414,7 @@
         <w:pStyle w:val="ListBullet"/>
       </w:pPr>
       <w:r>
-        <w:t>Équipe : deux développeurs appuyés par des assistants IA et des experts ponctuels.</w:t>
+        <w:t>Équipe : deux développeurs appuyés par des experts ponctuels et une automatisation renforcée.</w:t>
       </w:r>
     </w:p>
     <w:p>

</xml_diff>